<commit_message>
fix(cv): remove internal copy across active artifacts
</commit_message>
<xml_diff>
--- a/output/docx/Sami_Halawa_GCP_AI_Engineer_Focused_CV.docx
+++ b/output/docx/Sami_Halawa_GCP_AI_Engineer_Focused_CV.docx
@@ -873,7 +873,7 @@
           <w:color w:val="1B232D"/>
           <w:sz w:val="18"/>
         </w:rPr>
-        <w:t>Converted commercial requirements into architecture, milestones, dashboards and stakeholder-ready outputs for a signed EUR 35,000 scope; EUR 17,500 milestone received and 69 delivery-proof captures produced.</w:t>
+        <w:t>Converted commercial requirements into architecture, milestones, dashboards and stakeholder-ready outputs for a signed EUR 35,000 scope, with a EUR 17,500 milestone received.</w:t>
       </w:r>
     </w:p>
     <w:p>
@@ -1218,7 +1218,7 @@
           <w:color w:val="1B232D"/>
           <w:sz w:val="18"/>
         </w:rPr>
-        <w:t xml:space="preserve">Google Cloud Professional Machine Learning Engineer exam-blueprint alignment (certification not claimed). </w:t>
+        <w:t xml:space="preserve">Google Cloud Professional Machine Learning Engineer exam-domain experience. </w:t>
       </w:r>
       <w:r>
         <w:rPr>
@@ -2006,7 +2006,7 @@
           <w:color w:val="1B232D"/>
           <w:sz w:val="18"/>
         </w:rPr>
-        <w:t xml:space="preserve">Selected public proof. </w:t>
+        <w:t xml:space="preserve">Open-source engineering and technical publishing. </w:t>
       </w:r>
       <w:r>
         <w:rPr>

</xml_diff>